<commit_message>
Add preface explaining LTSC/IoT LTSC/IoT GA editions
- Added preface to email (section before numbered content)
- Added preface to README.md with edition overview table
- Regenerated Word document with preface as opening chapter
- Explains purpose, use cases, and key differences of each edition

Co-authored-by: Copilot <223556219+Copilot@users.noreply.github.com>
</commit_message>
<xml_diff>
--- a/Windows11_LTSC_IoT_Guida_Completa.docx
+++ b/Windows11_LTSC_IoT_Guida_Completa.docx
@@ -95,6 +95,14 @@
         <w:rPr>
           <w:sz w:val="24"/>
         </w:rPr>
+        <w:t xml:space="preserve">     Prefazione: Le edizioni Windows 11 per scenari specializzati</w:t>
+      </w:r>
+    </w:p>
+    <w:p>
+      <w:r>
+        <w:rPr>
+          <w:sz w:val="24"/>
+        </w:rPr>
         <w:t>1.  Attivazione KMS per Windows 11 LTSC e LTSC IoT 2024</w:t>
       </w:r>
     </w:p>
@@ -130,6 +138,429 @@
         <w:t>5.  Windows 11 IoT Enterprise GA vs LTSC — Guida Comparativa</w:t>
       </w:r>
     </w:p>
+    <w:p>
+      <w:r>
+        <w:br w:type="page"/>
+      </w:r>
+    </w:p>
+    <w:p>
+      <w:pPr>
+        <w:pStyle w:val="Heading1"/>
+      </w:pPr>
+      <w:r>
+        <w:t>Prefazione: Le edizioni Windows 11 per scenari specializzati</w:t>
+      </w:r>
+    </w:p>
+    <w:p>
+      <w:pPr>
+        <w:pStyle w:val="Heading2"/>
+      </w:pPr>
+      <w:r>
+        <w:t>Prefazione: Le edizioni Windows 11 per scenari specializzati</w:t>
+      </w:r>
+    </w:p>
+    <w:p>
+      <w:r>
+        <w:t>Microsoft offre diverse edizioni di Windows 11 pensate per scenari che vanno oltre la postazione di lavoro tradizionale. Comprendere le differenze è fondamentale per scegliere l'edizione corretta e prevedere le implicazioni su software, aggiornamenti e ciclo di vita dei dispositivi.</w:t>
+      </w:r>
+    </w:p>
+    <w:p>
+      <w:pPr>
+        <w:pStyle w:val="Heading3"/>
+      </w:pPr>
+      <w:r>
+        <w:t>Windows 11 Enterprise LTSC (Long-Term Servicing Channel)</w:t>
+      </w:r>
+    </w:p>
+    <w:p>
+      <w:r>
+        <w:t>Edizione progettata per workstation che richiedono stabilità assoluta e non necessitano di feature update. Il sistema operativo viene rilasciato in una versione "congelata" che riceve esclusivamente aggiornamenti di sicurezza per 5 anni. Tipicamente impiegata in scenari regolamentati, ambienti di produzione industriale, o postazioni dove le modifiche al sistema devono essere ridotte al minimo. Non include Microsoft Store, app consumer, né Copilot.</w:t>
+      </w:r>
+    </w:p>
+    <w:p>
+      <w:pPr>
+        <w:pStyle w:val="Heading3"/>
+      </w:pPr>
+      <w:r>
+        <w:t>Windows 11 IoT Enterprise LTSC</w:t>
+      </w:r>
+    </w:p>
+    <w:p>
+      <w:r>
+        <w:t>Variante della precedente destinata a dispositivi embedded e special-purpose con un ciclo di supporto esteso a 10 anni. Include tutte le funzionalità di Enterprise LTSC più un set di feature dedicate alla protezione e al lockdown del dispositivo:</w:t>
+      </w:r>
+    </w:p>
+    <w:p>
+      <w:pPr>
+        <w:pStyle w:val="ListBullet"/>
+      </w:pPr>
+      <w:r>
+        <w:t>Unified Write Filter (UWF) — protezione disco tramite overlay in RAM</w:t>
+      </w:r>
+    </w:p>
+    <w:p>
+      <w:pPr>
+        <w:pStyle w:val="ListBullet"/>
+      </w:pPr>
+      <w:r>
+        <w:t>Shell Launcher V2 — sostituzione dell'interfaccia Windows con un'applicazione custom</w:t>
+      </w:r>
+    </w:p>
+    <w:p>
+      <w:pPr>
+        <w:pStyle w:val="ListBullet"/>
+      </w:pPr>
+      <w:r>
+        <w:t>Keyboard Filter — blocco combinazioni tasti per impedire l'uscita dall'app</w:t>
+      </w:r>
+    </w:p>
+    <w:p>
+      <w:pPr>
+        <w:pStyle w:val="ListBullet"/>
+      </w:pPr>
+      <w:r>
+        <w:t>Custom Logon — personalizzazione/nascondimento dell'interfaccia di logon</w:t>
+      </w:r>
+    </w:p>
+    <w:p>
+      <w:r>
+        <w:t>Ideale per chioschi, ATM, dispositivi medicali, SCADA e digital signage.</w:t>
+      </w:r>
+    </w:p>
+    <w:p>
+      <w:pPr>
+        <w:pStyle w:val="Heading3"/>
+      </w:pPr>
+      <w:r>
+        <w:t>Windows 11 IoT Enterprise GA (General Availability Channel)</w:t>
+      </w:r>
+    </w:p>
+    <w:p>
+      <w:r>
+        <w:t>Edizione meno nota ma strategicamente importante: offre le stesse feature embedded di IoT LTSC (UWF, Shell Launcher, Keyboard Filter) ma segue il modello di servicing standard con feature update annuali e supporto di 36 mesi per versione. Questo la rende compatibile con software che richiede un OS aggiornato (Teams, Microsoft 365 Apps) pur mantenendo le capacità di lockdown IoT.</w:t>
+      </w:r>
+    </w:p>
+    <w:p>
+      <w:r>
+        <w:t>È la scelta giusta quando servono sia le feature embedded sia la compatibilità software moderna, a patto di accettare aggiornamenti periodici.</w:t>
+      </w:r>
+    </w:p>
+    <w:p>
+      <w:pPr>
+        <w:pStyle w:val="Heading3"/>
+      </w:pPr>
+      <w:r>
+        <w:t>Riepilogo edizioni</w:t>
+      </w:r>
+    </w:p>
+    <w:tbl>
+      <w:tblPr>
+        <w:tblStyle w:val="TableGrid"/>
+        <w:tblW w:type="auto" w:w="0"/>
+        <w:tblLook w:firstColumn="1" w:firstRow="1" w:lastColumn="0" w:lastRow="0" w:noHBand="0" w:noVBand="1" w:val="04A0"/>
+      </w:tblPr>
+      <w:tblGrid>
+        <w:gridCol w:w="1881"/>
+        <w:gridCol w:w="1881"/>
+        <w:gridCol w:w="1881"/>
+        <w:gridCol w:w="1881"/>
+        <w:gridCol w:w="1881"/>
+      </w:tblGrid>
+      <w:tr>
+        <w:tc>
+          <w:tcPr>
+            <w:tcW w:type="dxa" w:w="1881"/>
+          </w:tcPr>
+          <w:p>
+            <w:r/>
+            <w:r>
+              <w:rPr>
+                <w:b/>
+                <w:sz w:val="18"/>
+              </w:rPr>
+              <w:t>Edizione</w:t>
+            </w:r>
+          </w:p>
+        </w:tc>
+        <w:tc>
+          <w:tcPr>
+            <w:tcW w:type="dxa" w:w="1881"/>
+          </w:tcPr>
+          <w:p>
+            <w:r/>
+            <w:r>
+              <w:rPr>
+                <w:b/>
+                <w:sz w:val="18"/>
+              </w:rPr>
+              <w:t>Stabilità</w:t>
+            </w:r>
+          </w:p>
+        </w:tc>
+        <w:tc>
+          <w:tcPr>
+            <w:tcW w:type="dxa" w:w="1881"/>
+          </w:tcPr>
+          <w:p>
+            <w:r/>
+            <w:r>
+              <w:rPr>
+                <w:b/>
+                <w:sz w:val="18"/>
+              </w:rPr>
+              <w:t>Supporto</w:t>
+            </w:r>
+          </w:p>
+        </w:tc>
+        <w:tc>
+          <w:tcPr>
+            <w:tcW w:type="dxa" w:w="1881"/>
+          </w:tcPr>
+          <w:p>
+            <w:r/>
+            <w:r>
+              <w:rPr>
+                <w:b/>
+                <w:sz w:val="18"/>
+              </w:rPr>
+              <w:t>Feature embedded</w:t>
+            </w:r>
+          </w:p>
+        </w:tc>
+        <w:tc>
+          <w:tcPr>
+            <w:tcW w:type="dxa" w:w="1881"/>
+          </w:tcPr>
+          <w:p>
+            <w:r/>
+            <w:r>
+              <w:rPr>
+                <w:b/>
+                <w:sz w:val="18"/>
+              </w:rPr>
+              <w:t>Software moderno</w:t>
+            </w:r>
+          </w:p>
+        </w:tc>
+      </w:tr>
+      <w:tr>
+        <w:tc>
+          <w:tcPr>
+            <w:tcW w:type="dxa" w:w="1881"/>
+          </w:tcPr>
+          <w:p>
+            <w:r/>
+            <w:r>
+              <w:rPr>
+                <w:sz w:val="18"/>
+              </w:rPr>
+              <w:t>Enterprise LTSC</w:t>
+            </w:r>
+          </w:p>
+        </w:tc>
+        <w:tc>
+          <w:tcPr>
+            <w:tcW w:type="dxa" w:w="1881"/>
+          </w:tcPr>
+          <w:p>
+            <w:r/>
+            <w:r>
+              <w:rPr>
+                <w:sz w:val="18"/>
+              </w:rPr>
+              <w:t>✅ Massima</w:t>
+            </w:r>
+          </w:p>
+        </w:tc>
+        <w:tc>
+          <w:tcPr>
+            <w:tcW w:type="dxa" w:w="1881"/>
+          </w:tcPr>
+          <w:p>
+            <w:r/>
+            <w:r>
+              <w:rPr>
+                <w:sz w:val="18"/>
+              </w:rPr>
+              <w:t>5 anni</w:t>
+            </w:r>
+          </w:p>
+        </w:tc>
+        <w:tc>
+          <w:tcPr>
+            <w:tcW w:type="dxa" w:w="1881"/>
+          </w:tcPr>
+          <w:p>
+            <w:r/>
+            <w:r>
+              <w:rPr>
+                <w:sz w:val="18"/>
+              </w:rPr>
+              <w:t>❌</w:t>
+            </w:r>
+          </w:p>
+        </w:tc>
+        <w:tc>
+          <w:tcPr>
+            <w:tcW w:type="dxa" w:w="1881"/>
+          </w:tcPr>
+          <w:p>
+            <w:r/>
+            <w:r>
+              <w:rPr>
+                <w:sz w:val="18"/>
+              </w:rPr>
+              <w:t>❌ Limitato</w:t>
+            </w:r>
+          </w:p>
+        </w:tc>
+      </w:tr>
+      <w:tr>
+        <w:tc>
+          <w:tcPr>
+            <w:tcW w:type="dxa" w:w="1881"/>
+          </w:tcPr>
+          <w:p>
+            <w:r/>
+            <w:r>
+              <w:rPr>
+                <w:sz w:val="18"/>
+              </w:rPr>
+              <w:t>IoT Enterprise LTSC</w:t>
+            </w:r>
+          </w:p>
+        </w:tc>
+        <w:tc>
+          <w:tcPr>
+            <w:tcW w:type="dxa" w:w="1881"/>
+          </w:tcPr>
+          <w:p>
+            <w:r/>
+            <w:r>
+              <w:rPr>
+                <w:sz w:val="18"/>
+              </w:rPr>
+              <w:t>✅ Massima</w:t>
+            </w:r>
+          </w:p>
+        </w:tc>
+        <w:tc>
+          <w:tcPr>
+            <w:tcW w:type="dxa" w:w="1881"/>
+          </w:tcPr>
+          <w:p>
+            <w:r/>
+            <w:r>
+              <w:rPr>
+                <w:sz w:val="18"/>
+              </w:rPr>
+              <w:t>10 anni</w:t>
+            </w:r>
+          </w:p>
+        </w:tc>
+        <w:tc>
+          <w:tcPr>
+            <w:tcW w:type="dxa" w:w="1881"/>
+          </w:tcPr>
+          <w:p>
+            <w:r/>
+            <w:r>
+              <w:rPr>
+                <w:sz w:val="18"/>
+              </w:rPr>
+              <w:t>✅</w:t>
+            </w:r>
+          </w:p>
+        </w:tc>
+        <w:tc>
+          <w:tcPr>
+            <w:tcW w:type="dxa" w:w="1881"/>
+          </w:tcPr>
+          <w:p>
+            <w:r/>
+            <w:r>
+              <w:rPr>
+                <w:sz w:val="18"/>
+              </w:rPr>
+              <w:t>❌ Limitato</w:t>
+            </w:r>
+          </w:p>
+        </w:tc>
+      </w:tr>
+      <w:tr>
+        <w:tc>
+          <w:tcPr>
+            <w:tcW w:type="dxa" w:w="1881"/>
+          </w:tcPr>
+          <w:p>
+            <w:r/>
+            <w:r>
+              <w:rPr>
+                <w:sz w:val="18"/>
+              </w:rPr>
+              <w:t>IoT Enterprise GA</w:t>
+            </w:r>
+          </w:p>
+        </w:tc>
+        <w:tc>
+          <w:tcPr>
+            <w:tcW w:type="dxa" w:w="1881"/>
+          </w:tcPr>
+          <w:p>
+            <w:r/>
+            <w:r>
+              <w:rPr>
+                <w:sz w:val="18"/>
+              </w:rPr>
+              <w:t>⚠️ Feature update</w:t>
+            </w:r>
+          </w:p>
+        </w:tc>
+        <w:tc>
+          <w:tcPr>
+            <w:tcW w:type="dxa" w:w="1881"/>
+          </w:tcPr>
+          <w:p>
+            <w:r/>
+            <w:r>
+              <w:rPr>
+                <w:sz w:val="18"/>
+              </w:rPr>
+              <w:t>36 mesi</w:t>
+            </w:r>
+          </w:p>
+        </w:tc>
+        <w:tc>
+          <w:tcPr>
+            <w:tcW w:type="dxa" w:w="1881"/>
+          </w:tcPr>
+          <w:p>
+            <w:r/>
+            <w:r>
+              <w:rPr>
+                <w:sz w:val="18"/>
+              </w:rPr>
+              <w:t>✅</w:t>
+            </w:r>
+          </w:p>
+        </w:tc>
+        <w:tc>
+          <w:tcPr>
+            <w:tcW w:type="dxa" w:w="1881"/>
+          </w:tcPr>
+          <w:p>
+            <w:r/>
+            <w:r>
+              <w:rPr>
+                <w:sz w:val="18"/>
+              </w:rPr>
+              <w:t>✅ Ampio</w:t>
+            </w:r>
+          </w:p>
+        </w:tc>
+      </w:tr>
+    </w:tbl>
+    <w:p/>
     <w:p>
       <w:r>
         <w:br w:type="page"/>

</xml_diff>